<commit_message>
fix(w7): reposition figures/tables + add 3 KS Z-test sub-tables for full CR12 empirical coverage
- Extract 3 new One-Sample KS Z-test output tables from Artikel 12
  (art12_ks_h1/h2/h3 on pages 12/14/16); validate_figures now expects 16.
- CR12 §3 Temuan Empiris: pair each frequency-distribution table
  (Tabel 2/3/4) with its KS output sub-table for full empirical view.
- CR12 §6 Metodologi Statistik: remove redundant table embeds; replace
  with cross-reference paragraph pointing back to §3 evidence.
- RMK: move Gambar 1 (Strategic Themes) from end of §4 to start of §5
  where Related vs Unrelated discussion actually begins.
- RMK §6: move Kraft-Heinz callout from end of section to end of
  'Empat Tipe Cross-Business Value-Chain Fit' sub so concrete example
  immediately follows the four matchup types it illustrates.

Co-Authored-By: Claude Opus 4.7 (1M context) <noreply@anthropic.com>
</commit_message>
<xml_diff>
--- a/RMK/01079_Dzaki Muhammad Yusfian_RMK Pert. 7.docx
+++ b/RMK/01079_Dzaki Muhammad Yusfian_RMK Pert. 7.docx
@@ -1666,7 +1666,7 @@
     </w:p>
     <w:bookmarkEnd w:id="21"/>
     <w:bookmarkEnd w:id="22"/>
-    <w:bookmarkStart w:id="30" w:name="pendekatan-diversifikasi"/>
+    <w:bookmarkStart w:id="27" w:name="pendekatan-diversifikasi"/>
     <w:p>
       <w:pPr>
         <w:pStyle w:val="Heading2"/>
@@ -1981,7 +1981,7 @@
       </w:r>
     </w:p>
     <w:bookmarkEnd w:id="25"/>
-    <w:bookmarkStart w:id="29" w:name="kriteria-pemilihan-pendekatan"/>
+    <w:bookmarkStart w:id="26" w:name="kriteria-pemilihan-pendekatan"/>
     <w:p>
       <w:pPr>
         <w:pStyle w:val="Heading3"/>
@@ -2264,6 +2264,47 @@
       </w:r>
     </w:p>
     <w:p>
+      <w:r>
+        <w:pict>
+          <v:rect style="width:0;height:1.5pt" o:hralign="center" o:hrstd="t" o:hr="t"/>
+        </w:pict>
+      </w:r>
+    </w:p>
+    <w:bookmarkEnd w:id="26"/>
+    <w:bookmarkEnd w:id="27"/>
+    <w:bookmarkStart w:id="35" w:name="X3a18a6d7a09e9124bbbde8601d57c5dd4e03adb"/>
+    <w:p>
+      <w:pPr>
+        <w:pStyle w:val="Heading2"/>
+      </w:pPr>
+      <w:r>
+        <w:t xml:space="preserve">5. Pilihan Jalur: Diversifikasi</w:t>
+      </w:r>
+      <w:r>
+        <w:t xml:space="preserve"> </w:t>
+      </w:r>
+      <w:r>
+        <w:rPr>
+          <w:i/>
+          <w:iCs/>
+        </w:rPr>
+        <w:t xml:space="preserve">Related</w:t>
+      </w:r>
+      <w:r>
+        <w:t xml:space="preserve"> </w:t>
+      </w:r>
+      <w:r>
+        <w:t xml:space="preserve">vs. </w:t>
+      </w:r>
+      <w:r>
+        <w:rPr>
+          <w:i/>
+          <w:iCs/>
+        </w:rPr>
+        <w:t xml:space="preserve">Unrelated</w:t>
+      </w:r>
+    </w:p>
+    <w:p>
       <w:pPr>
         <w:pStyle w:val="CaptionedFigure"/>
       </w:pPr>
@@ -2272,18 +2313,18 @@
           <wp:inline>
             <wp:extent cx="5791200" cy="6006317"/>
             <wp:effectExtent b="0" l="0" r="0" t="0"/>
-            <wp:docPr descr="Gambar 1. Strategic Themes of Multibusiness Corporation (Related vs Unrelated Diversification)" title="" id="27" name="Picture"/>
+            <wp:docPr descr="Gambar 1. Strategic Themes of Multibusiness Corporation (Related vs Unrelated Diversification)" title="" id="29" name="Picture"/>
             <a:graphic>
               <a:graphicData uri="http://schemas.openxmlformats.org/drawingml/2006/picture">
                 <pic:pic>
                   <pic:nvPicPr>
-                    <pic:cNvPr descr="D:/DZAKI/S2/Sem.%201/Manajemen%20Strategik/Dev%20Assistant/temp/ch8_figures/figure_8_1.png" id="28" name="Picture"/>
+                    <pic:cNvPr descr="D:/DZAKI/S2/Sem.%201/Manajemen%20Strategik/Dev%20Assistant/temp/ch8_figures/figure_8_1.png" id="30" name="Picture"/>
                     <pic:cNvPicPr>
                       <a:picLocks noChangeArrowheads="1" noChangeAspect="1"/>
                     </pic:cNvPicPr>
                   </pic:nvPicPr>
                   <pic:blipFill>
-                    <a:blip r:embed="rId26"/>
+                    <a:blip r:embed="rId28"/>
                     <a:stretch>
                       <a:fillRect/>
                     </a:stretch>
@@ -2339,7 +2380,7 @@
         <w:pStyle w:val="BodyText"/>
       </w:pPr>
       <w:r>
-        <w:t xml:space="preserve">Gambar 1 menunjukkan dua tema strategis utama yang dapat dipilih oleh perusahaan terdiversifikasi. Pilihan ini menjadi kerangka untuk seluruh pembahasan diversifikasi berikutnya — apakah membangun portofolio bisnis yang saling berbagi nilai-rantai (</w:t>
+        <w:t xml:space="preserve">Gambar 1 menunjukkan dua tema strategis utama yang dapat dipilih oleh perusahaan terdiversifikasi. Pilihan ini menjadi kerangka untuk seluruh pembahasan §5 — apakah membangun portofolio bisnis yang saling berbagi nilai-rantai (</w:t>
       </w:r>
       <w:r>
         <w:rPr>
@@ -2360,47 +2401,6 @@
       </w:r>
       <w:r>
         <w:t xml:space="preserve">).</w:t>
-      </w:r>
-    </w:p>
-    <w:p>
-      <w:r>
-        <w:pict>
-          <v:rect style="width:0;height:1.5pt" o:hralign="center" o:hrstd="t" o:hr="t"/>
-        </w:pict>
-      </w:r>
-    </w:p>
-    <w:bookmarkEnd w:id="29"/>
-    <w:bookmarkEnd w:id="30"/>
-    <w:bookmarkStart w:id="35" w:name="X3a18a6d7a09e9124bbbde8601d57c5dd4e03adb"/>
-    <w:p>
-      <w:pPr>
-        <w:pStyle w:val="Heading2"/>
-      </w:pPr>
-      <w:r>
-        <w:t xml:space="preserve">5. Pilihan Jalur: Diversifikasi</w:t>
-      </w:r>
-      <w:r>
-        <w:t xml:space="preserve"> </w:t>
-      </w:r>
-      <w:r>
-        <w:rPr>
-          <w:i/>
-          <w:iCs/>
-        </w:rPr>
-        <w:t xml:space="preserve">Related</w:t>
-      </w:r>
-      <w:r>
-        <w:t xml:space="preserve"> </w:t>
-      </w:r>
-      <w:r>
-        <w:t xml:space="preserve">vs. </w:t>
-      </w:r>
-      <w:r>
-        <w:rPr>
-          <w:i/>
-          <w:iCs/>
-        </w:rPr>
-        <w:t xml:space="preserve">Unrelated</w:t>
       </w:r>
     </w:p>
     <w:bookmarkStart w:id="31" w:name="Xda3200119568267ef1d16eb91bec3058de576f8"/>
@@ -3699,7 +3699,7 @@
       </w:r>
     </w:p>
     <w:bookmarkEnd w:id="36"/>
-    <w:bookmarkStart w:id="37" w:name="X001e87499c500e8f2c91e00c33f02ac8cfa65c5"/>
+    <w:bookmarkStart w:id="40" w:name="X001e87499c500e8f2c91e00c33f02ac8cfa65c5"/>
     <w:p>
       <w:pPr>
         <w:pStyle w:val="Heading3"/>
@@ -4095,8 +4095,196 @@
         <w:t xml:space="preserve">secara bersama, sehingga biaya logistik per SKU lebih rendah daripada bila masing-masing kategori membangun jaringan terpisah.</w:t>
       </w:r>
     </w:p>
-    <w:bookmarkEnd w:id="37"/>
-    <w:bookmarkStart w:id="38" w:name="X87f18cc26cb16bba1782b86ab1e35aff63ba9ca"/>
+    <w:p>
+      <w:pPr>
+        <w:pStyle w:val="CaptionedFigure"/>
+      </w:pPr>
+      <w:r>
+        <w:drawing>
+          <wp:inline>
+            <wp:extent cx="5791200" cy="6470519"/>
+            <wp:effectExtent b="0" l="0" r="0" t="0"/>
+            <wp:docPr descr="Boks Concepts &amp; Connections 8.1. The Kraft-Heinz Merger: Pursuing the Benefits of Cross-Business Strategic Fit" title="" id="38" name="Picture"/>
+            <a:graphic>
+              <a:graphicData uri="http://schemas.openxmlformats.org/drawingml/2006/picture">
+                <pic:pic>
+                  <pic:nvPicPr>
+                    <pic:cNvPr descr="D:/DZAKI/S2/Sem.%201/Manajemen%20Strategik/Dev%20Assistant/temp/ch8_figures/cc_8_1_kraft_heinz.png" id="39" name="Picture"/>
+                    <pic:cNvPicPr>
+                      <a:picLocks noChangeArrowheads="1" noChangeAspect="1"/>
+                    </pic:cNvPicPr>
+                  </pic:nvPicPr>
+                  <pic:blipFill>
+                    <a:blip r:embed="rId37"/>
+                    <a:stretch>
+                      <a:fillRect/>
+                    </a:stretch>
+                  </pic:blipFill>
+                  <pic:spPr bwMode="auto">
+                    <a:xfrm>
+                      <a:off x="0" y="0"/>
+                      <a:ext cx="5791200" cy="6470519"/>
+                    </a:xfrm>
+                    <a:prstGeom prst="rect">
+                      <a:avLst/>
+                    </a:prstGeom>
+                    <a:noFill/>
+                    <a:ln w="9525">
+                      <a:noFill/>
+                      <a:headEnd/>
+                      <a:tailEnd/>
+                    </a:ln>
+                  </pic:spPr>
+                </pic:pic>
+              </a:graphicData>
+            </a:graphic>
+          </wp:inline>
+        </w:drawing>
+      </w:r>
+    </w:p>
+    <w:p>
+      <w:pPr>
+        <w:pStyle w:val="ImageCaption"/>
+      </w:pPr>
+      <w:r>
+        <w:rPr>
+          <w:i/>
+          <w:iCs/>
+        </w:rPr>
+        <w:t xml:space="preserve">Boks Concepts &amp; Connections 8.1. The Kraft-Heinz Merger: Pursuing the Benefits of Cross-Business Strategic Fit</w:t>
+      </w:r>
+    </w:p>
+    <w:p>
+      <w:pPr>
+        <w:pStyle w:val="BodyText"/>
+      </w:pPr>
+      <w:r>
+        <w:rPr>
+          <w:i/>
+          <w:iCs/>
+        </w:rPr>
+        <w:t xml:space="preserve">Sumber: Gamble, Peteraf &amp; Thompson (2021), Essentials of Strategic Management, Ch.8 Concepts &amp; Connections 8.1, hlm. 159</w:t>
+      </w:r>
+    </w:p>
+    <w:p>
+      <w:pPr>
+        <w:pStyle w:val="BodyText"/>
+      </w:pPr>
+      <w:r>
+        <w:t xml:space="preserve">Boks Concepts &amp; Connections 8.1 menyajikan ilustrasi konkret dari merger Kraft–Heinz tahun 2015 (USD 62,6 milyar) sebagai contoh penerapan keempat tipe</w:t>
+      </w:r>
+      <w:r>
+        <w:t xml:space="preserve"> </w:t>
+      </w:r>
+      <w:r>
+        <w:rPr>
+          <w:i/>
+          <w:iCs/>
+        </w:rPr>
+        <w:t xml:space="preserve">value-chain matchups</w:t>
+      </w:r>
+      <w:r>
+        <w:t xml:space="preserve"> </w:t>
+      </w:r>
+      <w:r>
+        <w:t xml:space="preserve">yang baru saja dibahas. Kasus ini memberi pembaca contoh empiris langsung — sebelum kerangka abstrak</w:t>
+      </w:r>
+      <w:r>
+        <w:t xml:space="preserve"> </w:t>
+      </w:r>
+      <w:r>
+        <w:rPr>
+          <w:i/>
+          <w:iCs/>
+        </w:rPr>
+        <w:t xml:space="preserve">economies of scope</w:t>
+      </w:r>
+      <w:r>
+        <w:t xml:space="preserve"> </w:t>
+      </w:r>
+      <w:r>
+        <w:t xml:space="preserve">diuraikan pada sub-bagian berikutnya — tentang bagaimana</w:t>
+      </w:r>
+      <w:r>
+        <w:t xml:space="preserve"> </w:t>
+      </w:r>
+      <w:r>
+        <w:rPr>
+          <w:i/>
+          <w:iCs/>
+        </w:rPr>
+        <w:t xml:space="preserve">supply chain fit</w:t>
+      </w:r>
+      <w:r>
+        <w:t xml:space="preserve"> </w:t>
+      </w:r>
+      <w:r>
+        <w:t xml:space="preserve">(pengadaan agregat),</w:t>
+      </w:r>
+      <w:r>
+        <w:t xml:space="preserve"> </w:t>
+      </w:r>
+      <w:r>
+        <w:rPr>
+          <w:i/>
+          <w:iCs/>
+        </w:rPr>
+        <w:t xml:space="preserve">manufacturing fit</w:t>
+      </w:r>
+      <w:r>
+        <w:t xml:space="preserve"> </w:t>
+      </w:r>
+      <w:r>
+        <w:t xml:space="preserve">(konsolidasi pabrik), serta</w:t>
+      </w:r>
+      <w:r>
+        <w:t xml:space="preserve"> </w:t>
+      </w:r>
+      <w:r>
+        <w:rPr>
+          <w:i/>
+          <w:iCs/>
+        </w:rPr>
+        <w:t xml:space="preserve">sales/marketing/brand fit</w:t>
+      </w:r>
+      <w:r>
+        <w:t xml:space="preserve"> </w:t>
+      </w:r>
+      <w:r>
+        <w:t xml:space="preserve">(rasionalisasi</w:t>
+      </w:r>
+      <w:r>
+        <w:t xml:space="preserve"> </w:t>
+      </w:r>
+      <w:r>
+        <w:rPr>
+          <w:i/>
+          <w:iCs/>
+        </w:rPr>
+        <w:t xml:space="preserve">brand portfolio</w:t>
+      </w:r>
+      <w:r>
+        <w:t xml:space="preserve">) dieksekusi secara bersamaan pada satu transaksi. Disiplin biaya 3G Capital pasca-merger menambah catatan penting: fit yang teoretis tidak otomatis menjadi sinergi nyata; ia memerlukan</w:t>
+      </w:r>
+      <w:r>
+        <w:t xml:space="preserve"> </w:t>
+      </w:r>
+      <w:r>
+        <w:rPr>
+          <w:i/>
+          <w:iCs/>
+        </w:rPr>
+        <w:t xml:space="preserve">operational discipline</w:t>
+      </w:r>
+      <w:r>
+        <w:t xml:space="preserve"> </w:t>
+      </w:r>
+      <w:r>
+        <w:t xml:space="preserve">yang konkret untuk diaktualisasi.</w:t>
+      </w:r>
+    </w:p>
+    <w:bookmarkEnd w:id="40"/>
+    <w:bookmarkStart w:id="41" w:name="X87f18cc26cb16bba1782b86ab1e35aff63ba9ca"/>
     <w:p>
       <w:pPr>
         <w:pStyle w:val="Heading3"/>
@@ -4391,7 +4579,7 @@
         <w:t xml:space="preserve">yang paling sulit ditiru pesaing berasal justru dari aset tak berwujud, bukan dari fasilitas fisik bersama.</w:t>
       </w:r>
     </w:p>
-    <w:bookmarkEnd w:id="38"/>
+    <w:bookmarkEnd w:id="41"/>
     <w:bookmarkStart w:id="45" w:name="Xa1e1e0a49891415fcc7a203b7801486e6111406"/>
     <w:p>
       <w:pPr>
@@ -4792,18 +4980,18 @@
           <wp:inline>
             <wp:extent cx="5791200" cy="6091232"/>
             <wp:effectExtent b="0" l="0" r="0" t="0"/>
-            <wp:docPr descr="Gambar 2. Cross-Business Value-Chain Strategic Fit" title="" id="40" name="Picture"/>
+            <wp:docPr descr="Gambar 2. Cross-Business Value-Chain Strategic Fit" title="" id="43" name="Picture"/>
             <a:graphic>
               <a:graphicData uri="http://schemas.openxmlformats.org/drawingml/2006/picture">
                 <pic:pic>
                   <pic:nvPicPr>
-                    <pic:cNvPr descr="D:/DZAKI/S2/Sem.%201/Manajemen%20Strategik/Dev%20Assistant/temp/ch8_figures/figure_8_2.png" id="41" name="Picture"/>
+                    <pic:cNvPr descr="D:/DZAKI/S2/Sem.%201/Manajemen%20Strategik/Dev%20Assistant/temp/ch8_figures/figure_8_2.png" id="44" name="Picture"/>
                     <pic:cNvPicPr>
                       <a:picLocks noChangeArrowheads="1" noChangeAspect="1"/>
                     </pic:cNvPicPr>
                   </pic:nvPicPr>
                   <pic:blipFill>
-                    <a:blip r:embed="rId39"/>
+                    <a:blip r:embed="rId42"/>
                     <a:stretch>
                       <a:fillRect/>
                     </a:stretch>
@@ -4925,162 +5113,6 @@
       </w:r>
       <w:r>
         <w:t xml:space="preserve">).</w:t>
-      </w:r>
-    </w:p>
-    <w:p>
-      <w:pPr>
-        <w:pStyle w:val="CaptionedFigure"/>
-      </w:pPr>
-      <w:r>
-        <w:drawing>
-          <wp:inline>
-            <wp:extent cx="5791200" cy="6470519"/>
-            <wp:effectExtent b="0" l="0" r="0" t="0"/>
-            <wp:docPr descr="Boks Concepts &amp; Connections 8.1. The Kraft-Heinz Merger: Pursuing the Benefits of Cross-Business Strategic Fit" title="" id="43" name="Picture"/>
-            <a:graphic>
-              <a:graphicData uri="http://schemas.openxmlformats.org/drawingml/2006/picture">
-                <pic:pic>
-                  <pic:nvPicPr>
-                    <pic:cNvPr descr="D:/DZAKI/S2/Sem.%201/Manajemen%20Strategik/Dev%20Assistant/temp/ch8_figures/cc_8_1_kraft_heinz.png" id="44" name="Picture"/>
-                    <pic:cNvPicPr>
-                      <a:picLocks noChangeArrowheads="1" noChangeAspect="1"/>
-                    </pic:cNvPicPr>
-                  </pic:nvPicPr>
-                  <pic:blipFill>
-                    <a:blip r:embed="rId42"/>
-                    <a:stretch>
-                      <a:fillRect/>
-                    </a:stretch>
-                  </pic:blipFill>
-                  <pic:spPr bwMode="auto">
-                    <a:xfrm>
-                      <a:off x="0" y="0"/>
-                      <a:ext cx="5791200" cy="6470519"/>
-                    </a:xfrm>
-                    <a:prstGeom prst="rect">
-                      <a:avLst/>
-                    </a:prstGeom>
-                    <a:noFill/>
-                    <a:ln w="9525">
-                      <a:noFill/>
-                      <a:headEnd/>
-                      <a:tailEnd/>
-                    </a:ln>
-                  </pic:spPr>
-                </pic:pic>
-              </a:graphicData>
-            </a:graphic>
-          </wp:inline>
-        </w:drawing>
-      </w:r>
-    </w:p>
-    <w:p>
-      <w:pPr>
-        <w:pStyle w:val="ImageCaption"/>
-      </w:pPr>
-      <w:r>
-        <w:rPr>
-          <w:i/>
-          <w:iCs/>
-        </w:rPr>
-        <w:t xml:space="preserve">Boks Concepts &amp; Connections 8.1. The Kraft-Heinz Merger: Pursuing the Benefits of Cross-Business Strategic Fit</w:t>
-      </w:r>
-    </w:p>
-    <w:p>
-      <w:pPr>
-        <w:pStyle w:val="BodyText"/>
-      </w:pPr>
-      <w:r>
-        <w:rPr>
-          <w:i/>
-          <w:iCs/>
-        </w:rPr>
-        <w:t xml:space="preserve">Sumber: Gamble, Peteraf &amp; Thompson (2021), Essentials of Strategic Management, Ch.8 Concepts &amp; Connections 8.1, hlm. 159</w:t>
-      </w:r>
-    </w:p>
-    <w:p>
-      <w:pPr>
-        <w:pStyle w:val="BodyText"/>
-      </w:pPr>
-      <w:r>
-        <w:t xml:space="preserve">Boks Concepts &amp; Connections 8.1 menyajikan ilustrasi konkret dari merger Kraft–Heinz tahun 2015 (USD 62,6 milyar) sebagai contoh</w:t>
-      </w:r>
-      <w:r>
-        <w:t xml:space="preserve"> </w:t>
-      </w:r>
-      <w:r>
-        <w:rPr>
-          <w:i/>
-          <w:iCs/>
-        </w:rPr>
-        <w:t xml:space="preserve">strategic fit</w:t>
-      </w:r>
-      <w:r>
-        <w:t xml:space="preserve"> </w:t>
-      </w:r>
-      <w:r>
-        <w:t xml:space="preserve">yang dieksekusi pada keempat tipe</w:t>
-      </w:r>
-      <w:r>
-        <w:t xml:space="preserve"> </w:t>
-      </w:r>
-      <w:r>
-        <w:rPr>
-          <w:i/>
-          <w:iCs/>
-        </w:rPr>
-        <w:t xml:space="preserve">value-chain matchups</w:t>
-      </w:r>
-      <w:r>
-        <w:t xml:space="preserve"> </w:t>
-      </w:r>
-      <w:r>
-        <w:t xml:space="preserve">yang dibahas pada §6. Kasus ini menjadi rujukan empiris untuk argumen bahwa</w:t>
-      </w:r>
-      <w:r>
-        <w:t xml:space="preserve"> </w:t>
-      </w:r>
-      <w:r>
-        <w:rPr>
-          <w:i/>
-          <w:iCs/>
-        </w:rPr>
-        <w:t xml:space="preserve">related diversification</w:t>
-      </w:r>
-      <w:r>
-        <w:t xml:space="preserve"> </w:t>
-      </w:r>
-      <w:r>
-        <w:t xml:space="preserve">hanya menghasilkan keunggulan kompetitif jika manajemen secara aktif mengeksploitasi fit lintas-divisi melalui konsolidasi pengadaan, distribusi, dan</w:t>
-      </w:r>
-      <w:r>
-        <w:t xml:space="preserve"> </w:t>
-      </w:r>
-      <w:r>
-        <w:rPr>
-          <w:i/>
-          <w:iCs/>
-        </w:rPr>
-        <w:t xml:space="preserve">brand portfolio</w:t>
-      </w:r>
-      <w:r>
-        <w:t xml:space="preserve">. Disiplin biaya 3G Capital pasca-merger menjadi catatan tambahan: fit yang teoretis tidak otomatis menjadi sinergi nyata; ia memerlukan</w:t>
-      </w:r>
-      <w:r>
-        <w:t xml:space="preserve"> </w:t>
-      </w:r>
-      <w:r>
-        <w:rPr>
-          <w:i/>
-          <w:iCs/>
-        </w:rPr>
-        <w:t xml:space="preserve">operational discipline</w:t>
-      </w:r>
-      <w:r>
-        <w:t xml:space="preserve"> </w:t>
-      </w:r>
-      <w:r>
-        <w:t xml:space="preserve">yang konkret untuk diaktualisasi.</w:t>
       </w:r>
     </w:p>
     <w:p>

</xml_diff>